<commit_message>
Fix title page order/spill; set margins L1.5 R/T/B 1.0
</commit_message>
<xml_diff>
--- a/thesis/Velasquez_CTA_Skincare_Thesis_DRAFT_002.docx
+++ b/thesis/Velasquez_CTA_Skincare_Thesis_DRAFT_002.docx
@@ -4,41 +4,81 @@
   <w:body>
     <w:p>
       <w:pPr>
-        <w:spacing w:before="0" w:after="0" w:line="480" w:lineRule="auto"/>
+        <w:spacing w:before="0" w:after="0" w:line="360" w:lineRule="auto"/>
+        <w:jc w:val="center"/>
+      </w:pPr>
+    </w:p>
+    <w:p>
+      <w:pPr>
+        <w:spacing w:before="0" w:after="0" w:line="360" w:lineRule="auto"/>
+        <w:jc w:val="center"/>
+      </w:pPr>
+    </w:p>
+    <w:p>
+      <w:pPr>
+        <w:spacing w:before="0" w:after="0" w:line="360" w:lineRule="auto"/>
+        <w:jc w:val="center"/>
+      </w:pPr>
+    </w:p>
+    <w:p>
+      <w:pPr>
+        <w:spacing w:before="0" w:after="0" w:line="360" w:lineRule="auto"/>
+        <w:jc w:val="center"/>
       </w:pPr>
       <w:r>
         <w:rPr>
           <w:rFonts w:ascii="Georgia" w:hAnsi="Georgia" w:eastAsia="Georgia"/>
-          <w:b w:val="0"/>
-          <w:i w:val="0"/>
-          <w:sz w:val="22"/>
+          <w:sz w:val="28"/>
+          <w:szCs w:val="28"/>
+          <w:b/>
         </w:rPr>
+        <w:t xml:space="preserve">PERSUASIVE LANGUAGE IN CALL-TO-ACTION PHRASES OF FACEBOOK SKINCARE PRODUCT ADVERTISEMENTS</w:t>
       </w:r>
     </w:p>
     <w:p>
       <w:pPr>
-        <w:spacing w:before="0" w:after="0" w:line="480" w:lineRule="auto"/>
+        <w:spacing w:before="0" w:after="0" w:line="360" w:lineRule="auto"/>
+        <w:jc w:val="center"/>
+      </w:pPr>
+    </w:p>
+    <w:p>
+      <w:pPr>
+        <w:spacing w:before="0" w:after="0" w:line="360" w:lineRule="auto"/>
+        <w:jc w:val="center"/>
+      </w:pPr>
+    </w:p>
+    <w:p>
+      <w:pPr>
+        <w:spacing w:before="0" w:after="0" w:line="360" w:lineRule="auto"/>
+        <w:jc w:val="center"/>
+      </w:pPr>
+    </w:p>
+    <w:p>
+      <w:pPr>
+        <w:spacing w:before="0" w:after="0" w:line="360" w:lineRule="auto"/>
+        <w:jc w:val="center"/>
       </w:pPr>
       <w:r>
         <w:rPr>
           <w:rFonts w:ascii="Georgia" w:hAnsi="Georgia" w:eastAsia="Georgia"/>
-          <w:b w:val="0"/>
-          <w:i w:val="0"/>
-          <w:sz w:val="22"/>
+          <w:sz w:val="24"/>
+          <w:szCs w:val="24"/>
         </w:rPr>
+        <w:t xml:space="preserve">A Thesis</w:t>
       </w:r>
     </w:p>
     <w:p>
       <w:pPr>
-        <w:spacing w:before="0" w:after="0" w:line="480" w:lineRule="auto"/>
+        <w:spacing w:before="0" w:after="0" w:line="360" w:lineRule="auto"/>
+        <w:jc w:val="center"/>
       </w:pPr>
       <w:r>
         <w:rPr>
           <w:rFonts w:ascii="Georgia" w:hAnsi="Georgia" w:eastAsia="Georgia"/>
-          <w:b w:val="0"/>
-          <w:i w:val="0"/>
-          <w:sz w:val="22"/>
+          <w:sz w:val="24"/>
+          <w:szCs w:val="24"/>
         </w:rPr>
+        <w:t xml:space="preserve">Presented to the faculty</w:t>
       </w:r>
     </w:p>
     <w:p>
@@ -49,50 +89,52 @@
       <w:r>
         <w:rPr>
           <w:rFonts w:ascii="Georgia" w:hAnsi="Georgia" w:eastAsia="Georgia"/>
-          <w:b/>
-          <w:i w:val="0"/>
-          <w:sz w:val="28"/>
+          <w:sz w:val="24"/>
+          <w:szCs w:val="24"/>
         </w:rPr>
-        <w:t>PERSUASIVE LANGUAGE IN CALL-TO-ACTION PHRASES OF FACEBOOK SKINCARE PRODUCT ADVERTISEMENTS</w:t>
+        <w:t xml:space="preserve">of the Department of English</w:t>
       </w:r>
     </w:p>
     <w:p>
       <w:pPr>
-        <w:spacing w:before="0" w:after="0" w:line="480" w:lineRule="auto"/>
+        <w:spacing w:before="0" w:after="0" w:line="360" w:lineRule="auto"/>
+        <w:jc w:val="center"/>
       </w:pPr>
       <w:r>
         <w:rPr>
           <w:rFonts w:ascii="Georgia" w:hAnsi="Georgia" w:eastAsia="Georgia"/>
-          <w:b w:val="0"/>
-          <w:i w:val="0"/>
-          <w:sz w:val="22"/>
+          <w:sz w:val="24"/>
+          <w:szCs w:val="24"/>
         </w:rPr>
+        <w:t xml:space="preserve">College of Arts and Sciences</w:t>
       </w:r>
     </w:p>
     <w:p>
       <w:pPr>
-        <w:spacing w:before="0" w:after="0" w:line="480" w:lineRule="auto"/>
+        <w:spacing w:before="0" w:after="0" w:line="360" w:lineRule="auto"/>
+        <w:jc w:val="center"/>
       </w:pPr>
       <w:r>
         <w:rPr>
           <w:rFonts w:ascii="Georgia" w:hAnsi="Georgia" w:eastAsia="Georgia"/>
-          <w:b w:val="0"/>
-          <w:i w:val="0"/>
-          <w:sz w:val="22"/>
+          <w:sz w:val="24"/>
+          <w:szCs w:val="24"/>
         </w:rPr>
+        <w:t xml:space="preserve">Pampanga State Agricultural University</w:t>
       </w:r>
     </w:p>
     <w:p>
       <w:pPr>
-        <w:spacing w:before="0" w:after="0" w:line="480" w:lineRule="auto"/>
+        <w:spacing w:before="0" w:after="0" w:line="360" w:lineRule="auto"/>
+        <w:jc w:val="center"/>
       </w:pPr>
       <w:r>
         <w:rPr>
           <w:rFonts w:ascii="Georgia" w:hAnsi="Georgia" w:eastAsia="Georgia"/>
-          <w:b w:val="0"/>
-          <w:i w:val="0"/>
-          <w:sz w:val="22"/>
+          <w:sz w:val="24"/>
+          <w:szCs w:val="24"/>
         </w:rPr>
+        <w:t xml:space="preserve">Magalang, Pampanga</w:t>
       </w:r>
     </w:p>
     <w:p>
@@ -100,14 +142,31 @@
         <w:spacing w:before="0" w:after="0" w:line="360" w:lineRule="auto"/>
         <w:jc w:val="center"/>
       </w:pPr>
+    </w:p>
+    <w:p>
+      <w:pPr>
+        <w:spacing w:before="0" w:after="0" w:line="360" w:lineRule="auto"/>
+        <w:jc w:val="center"/>
+      </w:pPr>
+    </w:p>
+    <w:p>
+      <w:pPr>
+        <w:spacing w:before="0" w:after="0" w:line="360" w:lineRule="auto"/>
+        <w:jc w:val="center"/>
+      </w:pPr>
+    </w:p>
+    <w:p>
+      <w:pPr>
+        <w:spacing w:before="0" w:after="0" w:line="360" w:lineRule="auto"/>
+        <w:jc w:val="center"/>
+      </w:pPr>
       <w:r>
         <w:rPr>
           <w:rFonts w:ascii="Georgia" w:hAnsi="Georgia" w:eastAsia="Georgia"/>
-          <w:b w:val="0"/>
-          <w:i w:val="0"/>
           <w:sz w:val="24"/>
+          <w:szCs w:val="24"/>
         </w:rPr>
-        <w:t>A Thesis</w:t>
+        <w:t xml:space="preserve">In partial fulfillment</w:t>
       </w:r>
     </w:p>
     <w:p>
@@ -118,11 +177,10 @@
       <w:r>
         <w:rPr>
           <w:rFonts w:ascii="Georgia" w:hAnsi="Georgia" w:eastAsia="Georgia"/>
-          <w:b w:val="0"/>
-          <w:i w:val="0"/>
           <w:sz w:val="24"/>
+          <w:szCs w:val="24"/>
         </w:rPr>
-        <w:t>Presented to the faculty</w:t>
+        <w:t xml:space="preserve">Of the Requirement for the Degree</w:t>
       </w:r>
     </w:p>
     <w:p>
@@ -133,11 +191,10 @@
       <w:r>
         <w:rPr>
           <w:rFonts w:ascii="Georgia" w:hAnsi="Georgia" w:eastAsia="Georgia"/>
-          <w:b w:val="0"/>
-          <w:i w:val="0"/>
           <w:sz w:val="24"/>
+          <w:szCs w:val="24"/>
         </w:rPr>
-        <w:t>of the Department of English</w:t>
+        <w:t xml:space="preserve">BACHELOR OF ARTS IN ENGLISH LANGUAGE STUDIES</w:t>
       </w:r>
     </w:p>
     <w:p>
@@ -145,14 +202,31 @@
         <w:spacing w:before="0" w:after="0" w:line="360" w:lineRule="auto"/>
         <w:jc w:val="center"/>
       </w:pPr>
+    </w:p>
+    <w:p>
+      <w:pPr>
+        <w:spacing w:before="0" w:after="0" w:line="360" w:lineRule="auto"/>
+        <w:jc w:val="center"/>
+      </w:pPr>
+    </w:p>
+    <w:p>
+      <w:pPr>
+        <w:spacing w:before="0" w:after="0" w:line="360" w:lineRule="auto"/>
+        <w:jc w:val="center"/>
+      </w:pPr>
+    </w:p>
+    <w:p>
+      <w:pPr>
+        <w:spacing w:before="0" w:after="0" w:line="360" w:lineRule="auto"/>
+        <w:jc w:val="center"/>
+      </w:pPr>
       <w:r>
         <w:rPr>
           <w:rFonts w:ascii="Georgia" w:hAnsi="Georgia" w:eastAsia="Georgia"/>
-          <w:b w:val="0"/>
-          <w:i w:val="0"/>
           <w:sz w:val="24"/>
+          <w:szCs w:val="24"/>
         </w:rPr>
-        <w:t>College of Arts and Sciences</w:t>
+        <w:t xml:space="preserve">By</w:t>
       </w:r>
     </w:p>
     <w:p>
@@ -160,14 +234,38 @@
         <w:spacing w:before="0" w:after="0" w:line="360" w:lineRule="auto"/>
         <w:jc w:val="center"/>
       </w:pPr>
+    </w:p>
+    <w:p>
+      <w:pPr>
+        <w:spacing w:before="0" w:after="0" w:line="360" w:lineRule="auto"/>
+        <w:jc w:val="center"/>
+      </w:pPr>
+    </w:p>
+    <w:p>
+      <w:pPr>
+        <w:spacing w:before="0" w:after="0" w:line="360" w:lineRule="auto"/>
+        <w:jc w:val="center"/>
+      </w:pPr>
+    </w:p>
+    <w:p>
+      <w:pPr>
+        <w:spacing w:before="0" w:after="0" w:line="360" w:lineRule="auto"/>
+        <w:jc w:val="center"/>
+      </w:pPr>
+    </w:p>
+    <w:p>
+      <w:pPr>
+        <w:spacing w:before="0" w:after="0" w:line="360" w:lineRule="auto"/>
+        <w:jc w:val="center"/>
+      </w:pPr>
       <w:r>
         <w:rPr>
           <w:rFonts w:ascii="Georgia" w:hAnsi="Georgia" w:eastAsia="Georgia"/>
-          <w:b w:val="0"/>
-          <w:i w:val="0"/>
           <w:sz w:val="24"/>
+          <w:szCs w:val="24"/>
+          <w:b/>
         </w:rPr>
-        <w:t>Pampanga State Agricultural University</w:t>
+        <w:t xml:space="preserve">AHLAI JEHZIEL M. VELASQUEZ</w:t>
       </w:r>
     </w:p>
     <w:p>
@@ -178,318 +276,26 @@
       <w:r>
         <w:rPr>
           <w:rFonts w:ascii="Georgia" w:hAnsi="Georgia" w:eastAsia="Georgia"/>
-          <w:b w:val="0"/>
-          <w:i w:val="0"/>
           <w:sz w:val="24"/>
+          <w:szCs w:val="24"/>
         </w:rPr>
-        <w:t>Magalang, Pampanga</w:t>
+        <w:t xml:space="preserve">October, 2026</w:t>
       </w:r>
     </w:p>
     <w:p>
       <w:pPr>
         <w:spacing w:before="0" w:after="0" w:line="480" w:lineRule="auto"/>
       </w:pPr>
-      <w:r>
-        <w:rPr>
-          <w:rFonts w:ascii="Georgia" w:hAnsi="Georgia" w:eastAsia="Georgia"/>
-          <w:b w:val="0"/>
-          <w:i w:val="0"/>
-          <w:sz w:val="22"/>
-        </w:rPr>
-      </w:r>
     </w:p>
     <w:p>
       <w:pPr>
         <w:spacing w:before="0" w:after="0" w:line="480" w:lineRule="auto"/>
       </w:pPr>
-      <w:r>
-        <w:rPr>
-          <w:rFonts w:ascii="Georgia" w:hAnsi="Georgia" w:eastAsia="Georgia"/>
-          <w:b w:val="0"/>
-          <w:i w:val="0"/>
-          <w:sz w:val="22"/>
-        </w:rPr>
-      </w:r>
     </w:p>
     <w:p>
       <w:pPr>
         <w:spacing w:before="0" w:after="0" w:line="480" w:lineRule="auto"/>
       </w:pPr>
-      <w:r>
-        <w:rPr>
-          <w:rFonts w:ascii="Georgia" w:hAnsi="Georgia" w:eastAsia="Georgia"/>
-          <w:b w:val="0"/>
-          <w:i w:val="0"/>
-          <w:sz w:val="22"/>
-        </w:rPr>
-      </w:r>
-    </w:p>
-    <w:p>
-      <w:pPr>
-        <w:spacing w:before="0" w:after="0" w:line="360" w:lineRule="auto"/>
-        <w:jc w:val="center"/>
-      </w:pPr>
-      <w:r>
-        <w:rPr>
-          <w:rFonts w:ascii="Georgia" w:hAnsi="Georgia" w:eastAsia="Georgia"/>
-          <w:b w:val="0"/>
-          <w:i w:val="0"/>
-          <w:sz w:val="24"/>
-        </w:rPr>
-        <w:t>In partial fulfillment</w:t>
-      </w:r>
-    </w:p>
-    <w:p>
-      <w:pPr>
-        <w:spacing w:before="0" w:after="0" w:line="360" w:lineRule="auto"/>
-        <w:jc w:val="center"/>
-      </w:pPr>
-      <w:r>
-        <w:rPr>
-          <w:rFonts w:ascii="Georgia" w:hAnsi="Georgia" w:eastAsia="Georgia"/>
-          <w:b w:val="0"/>
-          <w:i w:val="0"/>
-          <w:sz w:val="24"/>
-        </w:rPr>
-        <w:t>Of the Requirement for the Degree</w:t>
-      </w:r>
-    </w:p>
-    <w:p>
-      <w:pPr>
-        <w:spacing w:before="0" w:after="0" w:line="360" w:lineRule="auto"/>
-        <w:jc w:val="center"/>
-      </w:pPr>
-      <w:r>
-        <w:rPr>
-          <w:rFonts w:ascii="Georgia" w:hAnsi="Georgia" w:eastAsia="Georgia"/>
-          <w:b w:val="0"/>
-          <w:i w:val="0"/>
-          <w:sz w:val="24"/>
-        </w:rPr>
-        <w:t>BACHELOR OF ARTS IN ENGLISH LANGUAGE STUDIES</w:t>
-      </w:r>
-    </w:p>
-    <w:p>
-      <w:pPr>
-        <w:spacing w:before="0" w:after="0" w:line="480" w:lineRule="auto"/>
-      </w:pPr>
-      <w:r>
-        <w:rPr>
-          <w:rFonts w:ascii="Georgia" w:hAnsi="Georgia" w:eastAsia="Georgia"/>
-          <w:b w:val="0"/>
-          <w:i w:val="0"/>
-          <w:sz w:val="22"/>
-        </w:rPr>
-      </w:r>
-    </w:p>
-    <w:p>
-      <w:pPr>
-        <w:spacing w:before="0" w:after="0" w:line="480" w:lineRule="auto"/>
-      </w:pPr>
-      <w:r>
-        <w:rPr>
-          <w:rFonts w:ascii="Georgia" w:hAnsi="Georgia" w:eastAsia="Georgia"/>
-          <w:b w:val="0"/>
-          <w:i w:val="0"/>
-          <w:sz w:val="22"/>
-        </w:rPr>
-      </w:r>
-    </w:p>
-    <w:p>
-      <w:pPr>
-        <w:spacing w:before="0" w:after="0" w:line="480" w:lineRule="auto"/>
-      </w:pPr>
-      <w:r>
-        <w:rPr>
-          <w:rFonts w:ascii="Georgia" w:hAnsi="Georgia" w:eastAsia="Georgia"/>
-          <w:b w:val="0"/>
-          <w:i w:val="0"/>
-          <w:sz w:val="22"/>
-        </w:rPr>
-      </w:r>
-    </w:p>
-    <w:p>
-      <w:pPr>
-        <w:spacing w:before="0" w:after="0" w:line="360" w:lineRule="auto"/>
-        <w:jc w:val="center"/>
-      </w:pPr>
-      <w:r>
-        <w:rPr>
-          <w:rFonts w:ascii="Georgia" w:hAnsi="Georgia" w:eastAsia="Georgia"/>
-          <w:b w:val="0"/>
-          <w:i w:val="0"/>
-          <w:sz w:val="24"/>
-        </w:rPr>
-        <w:t>By</w:t>
-      </w:r>
-    </w:p>
-    <w:p>
-      <w:pPr>
-        <w:spacing w:before="0" w:after="0" w:line="480" w:lineRule="auto"/>
-      </w:pPr>
-      <w:r>
-        <w:rPr>
-          <w:rFonts w:ascii="Georgia" w:hAnsi="Georgia" w:eastAsia="Georgia"/>
-          <w:b w:val="0"/>
-          <w:i w:val="0"/>
-          <w:sz w:val="22"/>
-        </w:rPr>
-      </w:r>
-    </w:p>
-    <w:p>
-      <w:pPr>
-        <w:spacing w:before="0" w:after="0" w:line="480" w:lineRule="auto"/>
-      </w:pPr>
-      <w:r>
-        <w:rPr>
-          <w:rFonts w:ascii="Georgia" w:hAnsi="Georgia" w:eastAsia="Georgia"/>
-          <w:b w:val="0"/>
-          <w:i w:val="0"/>
-          <w:sz w:val="22"/>
-        </w:rPr>
-      </w:r>
-    </w:p>
-    <w:p>
-      <w:pPr>
-        <w:spacing w:before="0" w:after="0" w:line="480" w:lineRule="auto"/>
-      </w:pPr>
-      <w:r>
-        <w:rPr>
-          <w:rFonts w:ascii="Georgia" w:hAnsi="Georgia" w:eastAsia="Georgia"/>
-          <w:b w:val="0"/>
-          <w:i w:val="0"/>
-          <w:sz w:val="22"/>
-        </w:rPr>
-      </w:r>
-    </w:p>
-    <w:p>
-      <w:pPr>
-        <w:spacing w:before="0" w:after="0" w:line="480" w:lineRule="auto"/>
-      </w:pPr>
-      <w:r>
-        <w:rPr>
-          <w:rFonts w:ascii="Georgia" w:hAnsi="Georgia" w:eastAsia="Georgia"/>
-          <w:b w:val="0"/>
-          <w:i w:val="0"/>
-          <w:sz w:val="22"/>
-        </w:rPr>
-      </w:r>
-    </w:p>
-    <w:p>
-      <w:pPr>
-        <w:spacing w:before="0" w:after="0" w:line="480" w:lineRule="auto"/>
-      </w:pPr>
-      <w:r>
-        <w:rPr>
-          <w:rFonts w:ascii="Georgia" w:hAnsi="Georgia" w:eastAsia="Georgia"/>
-          <w:b w:val="0"/>
-          <w:i w:val="0"/>
-          <w:sz w:val="22"/>
-        </w:rPr>
-      </w:r>
-    </w:p>
-    <w:p>
-      <w:pPr>
-        <w:spacing w:before="0" w:after="0" w:line="480" w:lineRule="auto"/>
-      </w:pPr>
-      <w:r>
-        <w:rPr>
-          <w:rFonts w:ascii="Georgia" w:hAnsi="Georgia" w:eastAsia="Georgia"/>
-          <w:b w:val="0"/>
-          <w:i w:val="0"/>
-          <w:sz w:val="22"/>
-        </w:rPr>
-      </w:r>
-    </w:p>
-    <w:p>
-      <w:pPr>
-        <w:spacing w:before="0" w:after="0" w:line="360" w:lineRule="auto"/>
-        <w:jc w:val="center"/>
-      </w:pPr>
-      <w:r>
-        <w:rPr>
-          <w:rFonts w:ascii="Georgia" w:hAnsi="Georgia" w:eastAsia="Georgia"/>
-          <w:b/>
-          <w:i w:val="0"/>
-          <w:sz w:val="24"/>
-        </w:rPr>
-        <w:t>AHLAI JEHZIEL M. VELASQUEZ</w:t>
-      </w:r>
-    </w:p>
-    <w:p>
-      <w:pPr>
-        <w:spacing w:before="0" w:after="0" w:line="360" w:lineRule="auto"/>
-        <w:jc w:val="center"/>
-      </w:pPr>
-      <w:r>
-        <w:rPr>
-          <w:rFonts w:ascii="Georgia" w:hAnsi="Georgia" w:eastAsia="Georgia"/>
-          <w:b w:val="0"/>
-          <w:i w:val="0"/>
-          <w:sz w:val="24"/>
-        </w:rPr>
-        <w:t>October, 2026</w:t>
-      </w:r>
-    </w:p>
-    <w:p>
-      <w:pPr>
-        <w:spacing w:before="0" w:after="0" w:line="480" w:lineRule="auto"/>
-        <w:sectPr>
-          <w:headerReference w:type="first" r:id="rId9"/>
-          <w:headerReference w:type="default" r:id="rId10"/>
-          <w:type w:val="nextPage"/>
-          <w:pgSz w:w="12240" w:h="15840"/>
-          <w:pgMar w:top="1440" w:right="1440" w:bottom="1440" w:left="1440" w:header="720" w:footer="720"/>
-          <w:titlePg/>
-        </w:sectPr>
-      </w:pPr>
-      <w:r>
-        <w:rPr>
-          <w:rFonts w:ascii="Georgia" w:hAnsi="Georgia" w:eastAsia="Georgia"/>
-          <w:b w:val="0"/>
-          <w:i w:val="0"/>
-          <w:sz w:val="22"/>
-        </w:rPr>
-      </w:r>
-    </w:p>
-    <w:p>
-      <w:pPr>
-        <w:spacing w:before="0" w:after="0" w:line="480" w:lineRule="auto"/>
-      </w:pPr>
-      <w:r>
-        <w:rPr>
-          <w:rFonts w:ascii="Georgia" w:hAnsi="Georgia" w:eastAsia="Georgia"/>
-          <w:b w:val="0"/>
-          <w:i w:val="0"/>
-          <w:sz w:val="22"/>
-        </w:rPr>
-      </w:r>
-    </w:p>
-    <w:p>
-      <w:pPr>
-        <w:spacing w:before="0" w:after="0" w:line="480" w:lineRule="auto"/>
-      </w:pPr>
-      <w:r>
-        <w:rPr>
-          <w:rFonts w:ascii="Georgia" w:hAnsi="Georgia" w:eastAsia="Georgia"/>
-          <w:b w:val="0"/>
-          <w:i w:val="0"/>
-          <w:sz w:val="22"/>
-        </w:rPr>
-      </w:r>
-    </w:p>
-    <w:p>
-      <w:pPr>
-        <w:spacing w:before="0" w:after="0" w:line="480" w:lineRule="auto"/>
-      </w:pPr>
-      <w:r>
-        <w:rPr>
-          <w:rFonts w:ascii="Georgia" w:hAnsi="Georgia" w:eastAsia="Georgia"/>
-          <w:b w:val="0"/>
-          <w:i w:val="0"/>
-          <w:sz w:val="22"/>
-        </w:rPr>
-      </w:r>
     </w:p>
     <w:p>
       <w:pPr>
@@ -1979,7 +1785,7 @@
         <w:sectPr>
           <w:type w:val="nextPage"/>
           <w:pgSz w:w="12240" w:h="15840"/>
-          <w:pgMar w:top="1440" w:right="1440" w:bottom="1440" w:left="1440" w:header="720" w:footer="720"/>
+          <w:pgMar w:top="1440" w:right="1440" w:bottom="1440" w:left="2160" w:header="720" w:footer="720"/>
           <w:titlePg/>
         </w:sectPr>
       </w:pPr>
@@ -3301,7 +3107,7 @@
         <w:sectPr>
           <w:type w:val="nextPage"/>
           <w:pgSz w:w="12240" w:h="15840"/>
-          <w:pgMar w:top="1440" w:right="1440" w:bottom="1440" w:left="1440" w:header="720" w:footer="720"/>
+          <w:pgMar w:top="1440" w:right="1440" w:bottom="1440" w:left="2160" w:header="720" w:footer="720"/>
           <w:titlePg/>
         </w:sectPr>
       </w:pPr>
@@ -4196,7 +4002,7 @@
         <w:sectPr>
           <w:type w:val="nextPage"/>
           <w:pgSz w:w="12240" w:h="15840"/>
-          <w:pgMar w:top="1440" w:right="1440" w:bottom="1440" w:left="1440" w:header="720" w:footer="720"/>
+          <w:pgMar w:top="1440" w:right="1440" w:bottom="1440" w:left="2160" w:header="720" w:footer="720"/>
           <w:titlePg/>
         </w:sectPr>
       </w:pPr>
@@ -4548,7 +4354,7 @@
         <w:sectPr>
           <w:type w:val="nextPage"/>
           <w:pgSz w:w="12240" w:h="15840"/>
-          <w:pgMar w:top="1440" w:right="1440" w:bottom="1440" w:left="1440" w:header="720" w:footer="720"/>
+          <w:pgMar w:top="1440" w:right="1440" w:bottom="1440" w:left="2160" w:header="720" w:footer="720"/>
           <w:titlePg/>
         </w:sectPr>
       </w:pPr>
@@ -5684,7 +5490,7 @@
         <w:sectPr>
           <w:type w:val="nextPage"/>
           <w:pgSz w:w="12240" w:h="15840"/>
-          <w:pgMar w:top="1440" w:right="1440" w:bottom="1440" w:left="1440" w:header="720" w:footer="720"/>
+          <w:pgMar w:top="1440" w:right="1440" w:bottom="1440" w:left="2160" w:header="720" w:footer="720"/>
           <w:titlePg/>
         </w:sectPr>
       </w:pPr>
@@ -6737,7 +6543,7 @@
     </w:p>
     <w:sectPr>
       <w:pgSz w:w="12240" w:h="15840"/>
-      <w:pgMar w:top="1440" w:right="1440" w:bottom="1440" w:left="1440" w:header="720" w:footer="720" w:gutter="0"/>
+      <w:pgMar w:top="1440" w:right="1440" w:bottom="1440" w:left="2160" w:header="720" w:footer="720" w:gutter="0"/>
       <w:cols w:space="720"/>
       <w:titlePg/>
       <w:docGrid w:linePitch="360"/>

</xml_diff>

<commit_message>
A4 paper + tightened title page to stop spill
</commit_message>
<xml_diff>
--- a/thesis/Velasquez_CTA_Skincare_Thesis_DRAFT_002.docx
+++ b/thesis/Velasquez_CTA_Skincare_Thesis_DRAFT_002.docx
@@ -2,12 +2,6 @@
 <file path=word/document.xml><?xml version="1.0" encoding="utf-8"?>
 <w:document xmlns:wpc="http://schemas.microsoft.com/office/word/2010/wordprocessingCanvas" xmlns:mo="http://schemas.microsoft.com/office/mac/office/2008/main" xmlns:mc="http://schemas.openxmlformats.org/markup-compatibility/2006" xmlns:mv="urn:schemas-microsoft-com:mac:vml" xmlns:o="urn:schemas-microsoft-com:office:office" xmlns:r="http://schemas.openxmlformats.org/officeDocument/2006/relationships" xmlns:m="http://schemas.openxmlformats.org/officeDocument/2006/math" xmlns:v="urn:schemas-microsoft-com:vml" xmlns:wp14="http://schemas.microsoft.com/office/word/2010/wordprocessingDrawing" xmlns:wp="http://schemas.openxmlformats.org/drawingml/2006/wordprocessingDrawing" xmlns:w10="urn:schemas-microsoft-com:office:word" xmlns:w="http://schemas.openxmlformats.org/wordprocessingml/2006/main" xmlns:w14="http://schemas.microsoft.com/office/word/2010/wordml" xmlns:wpg="http://schemas.microsoft.com/office/word/2010/wordprocessingGroup" xmlns:wpi="http://schemas.microsoft.com/office/word/2010/wordprocessingInk" xmlns:wne="http://schemas.microsoft.com/office/word/2006/wordml" xmlns:wps="http://schemas.microsoft.com/office/word/2010/wordprocessingShape" mc:Ignorable="w14 wp14">
   <w:body>
-    <w:p>
-      <w:pPr>
-        <w:spacing w:before="0" w:after="0" w:line="360" w:lineRule="auto"/>
-        <w:jc w:val="center"/>
-      </w:pPr>
-    </w:p>
     <w:p>
       <w:pPr>
         <w:spacing w:before="0" w:after="0" w:line="360" w:lineRule="auto"/>
@@ -52,12 +46,6 @@
         <w:spacing w:before="0" w:after="0" w:line="360" w:lineRule="auto"/>
         <w:jc w:val="center"/>
       </w:pPr>
-    </w:p>
-    <w:p>
-      <w:pPr>
-        <w:spacing w:before="0" w:after="0" w:line="360" w:lineRule="auto"/>
-        <w:jc w:val="center"/>
-      </w:pPr>
       <w:r>
         <w:rPr>
           <w:rFonts w:ascii="Georgia" w:hAnsi="Georgia" w:eastAsia="Georgia"/>
@@ -154,12 +142,6 @@
         <w:spacing w:before="0" w:after="0" w:line="360" w:lineRule="auto"/>
         <w:jc w:val="center"/>
       </w:pPr>
-    </w:p>
-    <w:p>
-      <w:pPr>
-        <w:spacing w:before="0" w:after="0" w:line="360" w:lineRule="auto"/>
-        <w:jc w:val="center"/>
-      </w:pPr>
       <w:r>
         <w:rPr>
           <w:rFonts w:ascii="Georgia" w:hAnsi="Georgia" w:eastAsia="Georgia"/>
@@ -214,12 +196,6 @@
         <w:spacing w:before="0" w:after="0" w:line="360" w:lineRule="auto"/>
         <w:jc w:val="center"/>
       </w:pPr>
-    </w:p>
-    <w:p>
-      <w:pPr>
-        <w:spacing w:before="0" w:after="0" w:line="360" w:lineRule="auto"/>
-        <w:jc w:val="center"/>
-      </w:pPr>
       <w:r>
         <w:rPr>
           <w:rFonts w:ascii="Georgia" w:hAnsi="Georgia" w:eastAsia="Georgia"/>
@@ -228,18 +204,6 @@
         </w:rPr>
         <w:t xml:space="preserve">By</w:t>
       </w:r>
-    </w:p>
-    <w:p>
-      <w:pPr>
-        <w:spacing w:before="0" w:after="0" w:line="360" w:lineRule="auto"/>
-        <w:jc w:val="center"/>
-      </w:pPr>
-    </w:p>
-    <w:p>
-      <w:pPr>
-        <w:spacing w:before="0" w:after="0" w:line="360" w:lineRule="auto"/>
-        <w:jc w:val="center"/>
-      </w:pPr>
     </w:p>
     <w:p>
       <w:pPr>
@@ -285,16 +249,19 @@
     <w:p>
       <w:pPr>
         <w:spacing w:before="0" w:after="0" w:line="480" w:lineRule="auto"/>
+        <w:jc w:val="center"/>
       </w:pPr>
     </w:p>
     <w:p>
       <w:pPr>
         <w:spacing w:before="0" w:after="0" w:line="480" w:lineRule="auto"/>
+        <w:jc w:val="center"/>
       </w:pPr>
     </w:p>
     <w:p>
       <w:pPr>
         <w:spacing w:before="0" w:after="0" w:line="480" w:lineRule="auto"/>
+        <w:jc w:val="center"/>
       </w:pPr>
     </w:p>
     <w:p>
@@ -1784,7 +1751,7 @@
         <w:spacing w:before="0" w:after="0" w:line="480" w:lineRule="auto"/>
         <w:sectPr>
           <w:type w:val="nextPage"/>
-          <w:pgSz w:w="12240" w:h="15840"/>
+          <w:pgSz w:w="11906" w:h="16838"/>
           <w:pgMar w:top="1440" w:right="1440" w:bottom="1440" w:left="2160" w:header="720" w:footer="720"/>
           <w:titlePg/>
         </w:sectPr>
@@ -3106,7 +3073,7 @@
         <w:spacing w:before="0" w:after="0" w:line="480" w:lineRule="auto"/>
         <w:sectPr>
           <w:type w:val="nextPage"/>
-          <w:pgSz w:w="12240" w:h="15840"/>
+          <w:pgSz w:w="11906" w:h="16838"/>
           <w:pgMar w:top="1440" w:right="1440" w:bottom="1440" w:left="2160" w:header="720" w:footer="720"/>
           <w:titlePg/>
         </w:sectPr>
@@ -4001,7 +3968,7 @@
         <w:spacing w:before="0" w:after="0" w:line="480" w:lineRule="auto"/>
         <w:sectPr>
           <w:type w:val="nextPage"/>
-          <w:pgSz w:w="12240" w:h="15840"/>
+          <w:pgSz w:w="11906" w:h="16838"/>
           <w:pgMar w:top="1440" w:right="1440" w:bottom="1440" w:left="2160" w:header="720" w:footer="720"/>
           <w:titlePg/>
         </w:sectPr>
@@ -4353,7 +4320,7 @@
         <w:spacing w:before="0" w:after="0" w:line="480" w:lineRule="auto"/>
         <w:sectPr>
           <w:type w:val="nextPage"/>
-          <w:pgSz w:w="12240" w:h="15840"/>
+          <w:pgSz w:w="11906" w:h="16838"/>
           <w:pgMar w:top="1440" w:right="1440" w:bottom="1440" w:left="2160" w:header="720" w:footer="720"/>
           <w:titlePg/>
         </w:sectPr>
@@ -5489,7 +5456,7 @@
         <w:spacing w:before="0" w:after="0" w:line="480" w:lineRule="auto"/>
         <w:sectPr>
           <w:type w:val="nextPage"/>
-          <w:pgSz w:w="12240" w:h="15840"/>
+          <w:pgSz w:w="11906" w:h="16838"/>
           <w:pgMar w:top="1440" w:right="1440" w:bottom="1440" w:left="2160" w:header="720" w:footer="720"/>
           <w:titlePg/>
         </w:sectPr>
@@ -6542,7 +6509,7 @@
       </w:r>
     </w:p>
     <w:sectPr>
-      <w:pgSz w:w="12240" w:h="15840"/>
+      <w:pgSz w:w="11906" w:h="16838"/>
       <w:pgMar w:top="1440" w:right="1440" w:bottom="1440" w:left="2160" w:header="720" w:footer="720" w:gutter="0"/>
       <w:cols w:space="720"/>
       <w:titlePg/>

</xml_diff>

<commit_message>
Fix title page: section break so INTRODUCTION starts on next page
</commit_message>
<xml_diff>
--- a/thesis/Velasquez_CTA_Skincare_Thesis_DRAFT_002.docx
+++ b/thesis/Velasquez_CTA_Skincare_Thesis_DRAFT_002.docx
@@ -2,6 +2,12 @@
 <file path=word/document.xml><?xml version="1.0" encoding="utf-8"?>
 <w:document xmlns:wpc="http://schemas.microsoft.com/office/word/2010/wordprocessingCanvas" xmlns:mo="http://schemas.microsoft.com/office/mac/office/2008/main" xmlns:mc="http://schemas.openxmlformats.org/markup-compatibility/2006" xmlns:mv="urn:schemas-microsoft-com:mac:vml" xmlns:o="urn:schemas-microsoft-com:office:office" xmlns:r="http://schemas.openxmlformats.org/officeDocument/2006/relationships" xmlns:m="http://schemas.openxmlformats.org/officeDocument/2006/math" xmlns:v="urn:schemas-microsoft-com:vml" xmlns:wp14="http://schemas.microsoft.com/office/word/2010/wordprocessingDrawing" xmlns:wp="http://schemas.openxmlformats.org/drawingml/2006/wordprocessingDrawing" xmlns:w10="urn:schemas-microsoft-com:office:word" xmlns:w="http://schemas.openxmlformats.org/wordprocessingml/2006/main" xmlns:w14="http://schemas.microsoft.com/office/word/2010/wordml" xmlns:wpg="http://schemas.microsoft.com/office/word/2010/wordprocessingGroup" xmlns:wpi="http://schemas.microsoft.com/office/word/2010/wordprocessingInk" xmlns:wne="http://schemas.microsoft.com/office/word/2006/wordml" xmlns:wps="http://schemas.microsoft.com/office/word/2010/wordprocessingShape" mc:Ignorable="w14 wp14">
   <w:body>
+    <w:p>
+      <w:pPr>
+        <w:spacing w:before="0" w:after="0" w:line="360" w:lineRule="auto"/>
+        <w:jc w:val="center"/>
+      </w:pPr>
+    </w:p>
     <w:p>
       <w:pPr>
         <w:spacing w:before="0" w:after="0" w:line="360" w:lineRule="auto"/>
@@ -46,6 +52,12 @@
         <w:spacing w:before="0" w:after="0" w:line="360" w:lineRule="auto"/>
         <w:jc w:val="center"/>
       </w:pPr>
+    </w:p>
+    <w:p>
+      <w:pPr>
+        <w:spacing w:before="0" w:after="0" w:line="360" w:lineRule="auto"/>
+        <w:jc w:val="center"/>
+      </w:pPr>
       <w:r>
         <w:rPr>
           <w:rFonts w:ascii="Georgia" w:hAnsi="Georgia" w:eastAsia="Georgia"/>
@@ -142,6 +154,12 @@
         <w:spacing w:before="0" w:after="0" w:line="360" w:lineRule="auto"/>
         <w:jc w:val="center"/>
       </w:pPr>
+    </w:p>
+    <w:p>
+      <w:pPr>
+        <w:spacing w:before="0" w:after="0" w:line="360" w:lineRule="auto"/>
+        <w:jc w:val="center"/>
+      </w:pPr>
       <w:r>
         <w:rPr>
           <w:rFonts w:ascii="Georgia" w:hAnsi="Georgia" w:eastAsia="Georgia"/>
@@ -178,6 +196,12 @@
         </w:rPr>
         <w:t xml:space="preserve">BACHELOR OF ARTS IN ENGLISH LANGUAGE STUDIES</w:t>
       </w:r>
+    </w:p>
+    <w:p>
+      <w:pPr>
+        <w:spacing w:before="0" w:after="0" w:line="360" w:lineRule="auto"/>
+        <w:jc w:val="center"/>
+      </w:pPr>
     </w:p>
     <w:p>
       <w:pPr>
@@ -245,6 +269,17 @@
         </w:rPr>
         <w:t xml:space="preserve">October, 2026</w:t>
       </w:r>
+    </w:p>
+    <w:p>
+      <w:pPr>
+        <w:spacing w:before="0" w:after="0" w:line="360" w:lineRule="auto"/>
+        <w:sectPr>
+          <w:type w:val="nextPage"/>
+          <w:pgSz w:w="11906" w:h="16838"/>
+          <w:pgMar w:top="1440" w:right="1440" w:bottom="1440" w:left="2160" w:header="720" w:footer="720"/>
+          <w:titlePg/>
+        </w:sectPr>
+      </w:pPr>
     </w:p>
     <w:p>
       <w:pPr>

</xml_diff>

<commit_message>
Title page exact order + section break after Date (per user diagram)
</commit_message>
<xml_diff>
--- a/thesis/Velasquez_CTA_Skincare_Thesis_DRAFT_002.docx
+++ b/thesis/Velasquez_CTA_Skincare_Thesis_DRAFT_002.docx
@@ -228,12 +228,6 @@
         </w:rPr>
         <w:t xml:space="preserve">By</w:t>
       </w:r>
-    </w:p>
-    <w:p>
-      <w:pPr>
-        <w:spacing w:before="0" w:after="0" w:line="360" w:lineRule="auto"/>
-        <w:jc w:val="center"/>
-      </w:pPr>
     </w:p>
     <w:p>
       <w:pPr>

</xml_diff>

<commit_message>
Restore pagination headers and re-embed referenced images into DRAFT_002
Followed BAELS companion + FORMATTING.md: first-page headers empty, default Georgia 11 PAGE upper-right, titlePg, continuous. Removed invalid mid-body sectPr. Re-added media + relationships for the 7 rIds / 14 shapes that DRAFT_002 actually references (images were dropped in prior blank-slate copy).
</commit_message>
<xml_diff>
--- a/thesis/Velasquez_CTA_Skincare_Thesis_DRAFT_002.docx
+++ b/thesis/Velasquez_CTA_Skincare_Thesis_DRAFT_002.docx
@@ -415,7 +415,7 @@
           <w:headerReference w:type="default" r:id="rId12"/>
           <w:type w:val="nextPage"/>
           <w:pgSz w:w="11906" w:h="16838"/>
-          <w:pgMar w:top="1440" w:right="1440" w:bottom="1440" w:left="2160" w:header="720" w:footer="720"/>
+          <w:pgMar w:top="1440" w:right="1440" w:bottom="1440" w:left="2160" w:header="720" w:footer="720" w:gutter="0"/>
           <w:titlePg/>
         </w:sectPr>
       </w:pPr>
@@ -2059,9 +2059,11 @@
         <w:spacing w:before="0" w:after="0" w:lineRule="auto" w:line="360"/>
         <w:jc w:val="left"/>
         <w:sectPr>
+          <w:headerReference w:type="first" r:id="rId11"/>
+          <w:headerReference w:type="default" r:id="rId12"/>
           <w:type w:val="nextPage"/>
           <w:pgSz w:w="11906" w:h="16838"/>
-          <w:pgMar w:top="1440" w:right="1440" w:bottom="1440" w:left="2160" w:header="720" w:footer="720"/>
+          <w:pgMar w:top="1440" w:right="1440" w:bottom="1440" w:left="2160" w:header="720" w:footer="720" w:gutter="0"/>
           <w:titlePg/>
         </w:sectPr>
       </w:pPr>
@@ -3427,9 +3429,11 @@
         <w:spacing w:before="0" w:after="0" w:lineRule="auto" w:line="360"/>
         <w:jc w:val="left"/>
         <w:sectPr>
+          <w:headerReference w:type="first" r:id="rId11"/>
+          <w:headerReference w:type="default" r:id="rId12"/>
           <w:type w:val="nextPage"/>
           <w:pgSz w:w="11906" w:h="16838"/>
-          <w:pgMar w:top="1440" w:right="1440" w:bottom="1440" w:left="2160" w:header="720" w:footer="720"/>
+          <w:pgMar w:top="1440" w:right="1440" w:bottom="1440" w:left="2160" w:header="720" w:footer="720" w:gutter="0"/>
           <w:titlePg/>
         </w:sectPr>
       </w:pPr>
@@ -4393,9 +4397,11 @@
         <w:spacing w:before="0" w:after="0" w:lineRule="auto" w:line="360"/>
         <w:jc w:val="left"/>
         <w:sectPr>
+          <w:headerReference w:type="first" r:id="rId11"/>
+          <w:headerReference w:type="default" r:id="rId12"/>
           <w:type w:val="nextPage"/>
           <w:pgSz w:w="11906" w:h="16838"/>
-          <w:pgMar w:top="1440" w:right="1440" w:bottom="1440" w:left="2160" w:header="720" w:footer="720"/>
+          <w:pgMar w:top="1440" w:right="1440" w:bottom="1440" w:left="2160" w:header="720" w:footer="720" w:gutter="0"/>
           <w:titlePg/>
         </w:sectPr>
       </w:pPr>
@@ -4775,9 +4781,11 @@
         <w:spacing w:before="0" w:after="0" w:lineRule="auto" w:line="360"/>
         <w:jc w:val="left"/>
         <w:sectPr>
+          <w:headerReference w:type="first" r:id="rId11"/>
+          <w:headerReference w:type="default" r:id="rId12"/>
           <w:type w:val="nextPage"/>
           <w:pgSz w:w="11906" w:h="16838"/>
-          <w:pgMar w:top="1440" w:right="1440" w:bottom="1440" w:left="2160" w:header="720" w:footer="720"/>
+          <w:pgMar w:top="1440" w:right="1440" w:bottom="1440" w:left="2160" w:header="720" w:footer="720" w:gutter="0"/>
           <w:titlePg/>
         </w:sectPr>
       </w:pPr>
@@ -5926,9 +5934,11 @@
         <w:spacing w:before="0" w:after="0" w:lineRule="auto" w:line="360"/>
         <w:jc w:val="left"/>
         <w:sectPr>
+          <w:headerReference w:type="first" r:id="rId11"/>
+          <w:headerReference w:type="default" r:id="rId12"/>
           <w:type w:val="nextPage"/>
           <w:pgSz w:w="11906" w:h="16838"/>
-          <w:pgMar w:top="1440" w:right="1440" w:bottom="1440" w:left="2160" w:header="720" w:footer="720"/>
+          <w:pgMar w:top="1440" w:right="1440" w:bottom="1440" w:left="2160" w:header="720" w:footer="720" w:gutter="0"/>
           <w:titlePg/>
         </w:sectPr>
       </w:pPr>
@@ -7072,15 +7082,6 @@
         </w:rPr>
       </w:r>
     </w:p>
-    <w:sectPr>
-      <w:headerReference w:type="first" r:id="rId9"/>
-      <w:headerReference w:type="default" r:id="rId10"/>
-      <w:pgSz w:w="11906" w:h="16838"/>
-      <w:pgMar w:top="1440" w:right="1440" w:bottom="1440" w:left="2160" w:header="720" w:footer="720" w:gutter="0"/>
-      <w:cols w:space="720"/>
-      <w:titlePg/>
-      <w:docGrid w:linePitch="360"/>
-    </w:sectPr>
     <w:tbl>
       <w:tblPr>
         <w:tblStyle w:val="Table1"/>

</xml_diff>